<commit_message>
feat: add Phase 48 compressed GeoFM rescue
</commit_message>
<xml_diff>
--- a/paper/submission/final/Paper11_cover_letter_and_declarations.docx
+++ b/paper/submission/final/Paper11_cover_letter_and_declarations.docx
@@ -2,23 +2,15 @@
 <file path=word/document.xml><?xml version="1.0" encoding="utf-8"?>
 <w:document xmlns:w="http://schemas.openxmlformats.org/wordprocessingml/2006/main" xmlns:m="http://schemas.openxmlformats.org/officeDocument/2006/math" xmlns:r="http://schemas.openxmlformats.org/officeDocument/2006/relationships" xmlns:o="urn:schemas-microsoft-com:office:office" xmlns:v="urn:schemas-microsoft-com:vml" xmlns:w10="urn:schemas-microsoft-com:office:word" xmlns:a="http://schemas.openxmlformats.org/drawingml/2006/main" xmlns:pic="http://schemas.openxmlformats.org/drawingml/2006/picture" xmlns:wp="http://schemas.openxmlformats.org/drawingml/2006/wordprocessingDrawing">
   <w:body>
-    <w:p>
-      <w:pPr>
-        <w:pStyle w:val="Title"/>
+    <w:bookmarkStart w:id="17" w:name="paper11-cover-letter-and-declarations"/>
+    <w:p>
+      <w:pPr>
+        <w:pStyle w:val="Heading1"/>
       </w:pPr>
       <w:r>
         <w:t xml:space="preserve">Paper11 Cover Letter and Declarations</w:t>
       </w:r>
     </w:p>
-    <w:bookmarkStart w:id="18" w:name="paper11-cover-letter-and-declarations"/>
-    <w:p>
-      <w:pPr>
-        <w:pStyle w:val="Heading1"/>
-      </w:pPr>
-      <w:r>
-        <w:t xml:space="preserve">Paper11 Cover Letter and Declarations</w:t>
-      </w:r>
-    </w:p>
     <w:bookmarkStart w:id="9" w:name="cover-letter-draft"/>
     <w:p>
       <w:pPr>
@@ -47,43 +39,43 @@
         <w:t xml:space="preserve"> </w:t>
       </w:r>
       <w:r>
-        <w:t xml:space="preserve">“Evidence-gated rejection of unsupported GeoFM</w:t>
-      </w:r>
-      <w:r>
-        <w:t xml:space="preserve"> </w:t>
-      </w:r>
-      <w:r>
-        <w:t xml:space="preserve">superiority in reinforcement-learning farmland layout optimization”</w:t>
-      </w:r>
-      <w:r>
-        <w:t xml:space="preserve"> </w:t>
-      </w:r>
-      <w:r>
-        <w:t xml:space="preserve">for</w:t>
-      </w:r>
-      <w:r>
-        <w:t xml:space="preserve"> </w:t>
-      </w:r>
-      <w:r>
-        <w:t xml:space="preserve">consideration in International Journal of Applied Earth Observation and</w:t>
-      </w:r>
-      <w:r>
-        <w:t xml:space="preserve"> </w:t>
-      </w:r>
-      <w:r>
-        <w:t xml:space="preserve">Geoinformation. The manuscript examines whether geospatial foundation-model</w:t>
-      </w:r>
-      <w:r>
-        <w:t xml:space="preserve"> </w:t>
-      </w:r>
-      <w:r>
-        <w:t xml:space="preserve">(GeoFM) embeddings can be treated as decision-ready representations for</w:t>
-      </w:r>
-      <w:r>
-        <w:t xml:space="preserve"> </w:t>
-      </w:r>
-      <w:r>
-        <w:t xml:space="preserve">reinforcement-learning farmland layout optimization.</w:t>
+        <w:t xml:space="preserve">“Compressed GeoFM representations improve</w:t>
+      </w:r>
+      <w:r>
+        <w:t xml:space="preserve"> </w:t>
+      </w:r>
+      <w:r>
+        <w:t xml:space="preserve">held-out farmland layout optimization under evidence gates”</w:t>
+      </w:r>
+      <w:r>
+        <w:t xml:space="preserve"> </w:t>
+      </w:r>
+      <w:r>
+        <w:t xml:space="preserve">for consideration</w:t>
+      </w:r>
+      <w:r>
+        <w:t xml:space="preserve"> </w:t>
+      </w:r>
+      <w:r>
+        <w:t xml:space="preserve">in International Journal of Applied Earth Observation and Geoinformation. The</w:t>
+      </w:r>
+      <w:r>
+        <w:t xml:space="preserve"> </w:t>
+      </w:r>
+      <w:r>
+        <w:t xml:space="preserve">manuscript examines whether geospatial foundation-model (GeoFM) embeddings can</w:t>
+      </w:r>
+      <w:r>
+        <w:t xml:space="preserve"> </w:t>
+      </w:r>
+      <w:r>
+        <w:t xml:space="preserve">serve as controlled state representations for reinforcement-learning farmland</w:t>
+      </w:r>
+      <w:r>
+        <w:t xml:space="preserve"> </w:t>
+      </w:r>
+      <w:r>
+        <w:t xml:space="preserve">layout optimization.</w:t>
       </w:r>
     </w:p>
     <w:p>
@@ -115,31 +107,37 @@
         <w:t xml:space="preserve"> </w:t>
       </w:r>
       <w:r>
-        <w:t xml:space="preserve">and a calibrated-prior gate. The central finding is negative and evidence</w:t>
-      </w:r>
-      <w:r>
-        <w:t xml:space="preserve"> </w:t>
-      </w:r>
-      <w:r>
-        <w:t xml:space="preserve">bounded. Raw GeoFM B1 does not stably outperform explicit-feature B0, compressed</w:t>
-      </w:r>
-      <w:r>
-        <w:t xml:space="preserve"> </w:t>
-      </w:r>
-      <w:r>
-        <w:t xml:space="preserve">representation controls exceed raw B1, normalized-B1 and budget checks do not</w:t>
-      </w:r>
-      <w:r>
-        <w:t xml:space="preserve"> </w:t>
-      </w:r>
-      <w:r>
-        <w:t xml:space="preserve">rescue the claim, and the suitability-reward route is stopped by independent</w:t>
-      </w:r>
-      <w:r>
-        <w:t xml:space="preserve"> </w:t>
-      </w:r>
-      <w:r>
-        <w:t xml:space="preserve">label and calibrated-prior gates.</w:t>
+        <w:t xml:space="preserve">and a calibrated-prior gate. The central finding is positive but bounded. Raw</w:t>
+      </w:r>
+      <w:r>
+        <w:t xml:space="preserve"> </w:t>
+      </w:r>
+      <w:r>
+        <w:t xml:space="preserve">64-dimensional GeoFM direct injection does not stably outperform</w:t>
+      </w:r>
+      <w:r>
+        <w:t xml:space="preserve"> </w:t>
+      </w:r>
+      <w:r>
+        <w:t xml:space="preserve">explicit-feature B0, but Phase 48 shows that compressed GeoFM state routes</w:t>
+      </w:r>
+      <w:r>
+        <w:t xml:space="preserve"> </w:t>
+      </w:r>
+      <w:r>
+        <w:t xml:space="preserve">D4P8 and D4P16 outperform B0, raw B1, random D2, and shuffled D3 on mean</w:t>
+      </w:r>
+      <w:r>
+        <w:t xml:space="preserve"> </w:t>
+      </w:r>
+      <w:r>
+        <w:t xml:space="preserve">held-out base-reward policy reward. Suitability-reward and B2/B3 claims remain</w:t>
+      </w:r>
+      <w:r>
+        <w:t xml:space="preserve"> </w:t>
+      </w:r>
+      <w:r>
+        <w:t xml:space="preserve">blocked by independent-label and calibrated-prior gates.</w:t>
       </w:r>
     </w:p>
     <w:p>
@@ -153,31 +151,37 @@
         <w:t xml:space="preserve"> </w:t>
       </w:r>
       <w:r>
-        <w:t xml:space="preserve">reproducible cautionary test for using Earth-observation foundation-model</w:t>
-      </w:r>
-      <w:r>
-        <w:t xml:space="preserve"> </w:t>
-      </w:r>
-      <w:r>
-        <w:t xml:space="preserve">embeddings in operational land-use optimization. Rather than assuming that a</w:t>
-      </w:r>
-      <w:r>
-        <w:t xml:space="preserve"> </w:t>
-      </w:r>
-      <w:r>
-        <w:t xml:space="preserve">semantically rich remote-sensing embedding is a validated suitability variable,</w:t>
-      </w:r>
-      <w:r>
-        <w:t xml:space="preserve"> </w:t>
-      </w:r>
-      <w:r>
-        <w:t xml:space="preserve">the study shows how representation controls and independent-label gates can</w:t>
-      </w:r>
-      <w:r>
-        <w:t xml:space="preserve"> </w:t>
-      </w:r>
-      <w:r>
-        <w:t xml:space="preserve">prevent unsupported planning claims.</w:t>
+        <w:t xml:space="preserve">reproducible test for using Earth-observation foundation-model embeddings in</w:t>
+      </w:r>
+      <w:r>
+        <w:t xml:space="preserve"> </w:t>
+      </w:r>
+      <w:r>
+        <w:t xml:space="preserve">operational land-use optimization. Rather than assuming that a semantically</w:t>
+      </w:r>
+      <w:r>
+        <w:t xml:space="preserve"> </w:t>
+      </w:r>
+      <w:r>
+        <w:t xml:space="preserve">rich remote-sensing embedding is automatically a validated suitability variable,</w:t>
+      </w:r>
+      <w:r>
+        <w:t xml:space="preserve"> </w:t>
+      </w:r>
+      <w:r>
+        <w:t xml:space="preserve">the study shows that representation design is decisive: compressed GeoFM state</w:t>
+      </w:r>
+      <w:r>
+        <w:t xml:space="preserve"> </w:t>
+      </w:r>
+      <w:r>
+        <w:t xml:space="preserve">inputs support the base-reward planning policy, while raw injection and</w:t>
+      </w:r>
+      <w:r>
+        <w:t xml:space="preserve"> </w:t>
+      </w:r>
+      <w:r>
+        <w:t xml:space="preserve">suitability-reward routes require stricter evidence.</w:t>
       </w:r>
     </w:p>
     <w:p>
@@ -221,15 +225,49 @@
       <w:r>
         <w:t xml:space="preserve">[corresponding author name and contact information required]</w:t>
       </w:r>
+      <w:r>
+        <w:t xml:space="preserve"> </w:t>
+      </w:r>
+      <w:r>
+        <w:t xml:space="preserve">## Declaration of Competing Interest</w:t>
+      </w:r>
+    </w:p>
+    <w:p>
+      <w:pPr>
+        <w:pStyle w:val="BodyText"/>
+      </w:pPr>
+      <w:r>
+        <w:t xml:space="preserve">The authors declare that they have no known competing financial interests or</w:t>
+      </w:r>
+      <w:r>
+        <w:t xml:space="preserve"> </w:t>
+      </w:r>
+      <w:r>
+        <w:t xml:space="preserve">personal relationships that could have appeared to influence the work reported</w:t>
+      </w:r>
+      <w:r>
+        <w:t xml:space="preserve"> </w:t>
+      </w:r>
+      <w:r>
+        <w:t xml:space="preserve">in this paper.</w:t>
+      </w:r>
+    </w:p>
+    <w:p>
+      <w:pPr>
+        <w:pStyle w:val="BodyText"/>
+      </w:pPr>
+      <w:r>
+        <w:t xml:space="preserve">Author confirmation is required before submission.</w:t>
+      </w:r>
     </w:p>
     <w:bookmarkEnd w:id="9"/>
-    <w:bookmarkStart w:id="10" w:name="declaration-of-competing-interest"/>
+    <w:bookmarkStart w:id="10" w:name="funding"/>
     <w:p>
       <w:pPr>
         <w:pStyle w:val="Heading2"/>
       </w:pPr>
       <w:r>
-        <w:t xml:space="preserve">Declaration of Competing Interest</w:t>
+        <w:t xml:space="preserve">Funding</w:t>
       </w:r>
     </w:p>
     <w:p>
@@ -237,97 +275,59 @@
         <w:pStyle w:val="FirstParagraph"/>
       </w:pPr>
       <w:r>
-        <w:t xml:space="preserve">The authors declare that they have no known competing financial interests or</w:t>
-      </w:r>
-      <w:r>
-        <w:t xml:space="preserve"> </w:t>
-      </w:r>
-      <w:r>
-        <w:t xml:space="preserve">personal relationships that could have appeared to influence the work reported</w:t>
-      </w:r>
-      <w:r>
-        <w:t xml:space="preserve"> </w:t>
-      </w:r>
-      <w:r>
-        <w:t xml:space="preserve">in this paper.</w:t>
-      </w:r>
-    </w:p>
-    <w:p>
-      <w:pPr>
-        <w:pStyle w:val="BodyText"/>
-      </w:pPr>
+        <w:t xml:space="preserve">[author-supplied funding statement required]</w:t>
+      </w:r>
+    </w:p>
+    <w:bookmarkEnd w:id="10"/>
+    <w:bookmarkStart w:id="11" w:name="author-contributions"/>
+    <w:p>
+      <w:pPr>
+        <w:pStyle w:val="Heading2"/>
+      </w:pPr>
+      <w:r>
+        <w:t xml:space="preserve">Author Contributions</w:t>
+      </w:r>
+    </w:p>
+    <w:p>
+      <w:pPr>
+        <w:pStyle w:val="FirstParagraph"/>
+      </w:pPr>
+      <w:r>
+        <w:t xml:space="preserve">[author-supplied CRediT author contribution statement required]</w:t>
+      </w:r>
+    </w:p>
+    <w:bookmarkEnd w:id="11"/>
+    <w:bookmarkStart w:id="12" w:name="ethics-statement"/>
+    <w:p>
+      <w:pPr>
+        <w:pStyle w:val="Heading2"/>
+      </w:pPr>
+      <w:r>
+        <w:t xml:space="preserve">Ethics Statement</w:t>
+      </w:r>
+    </w:p>
+    <w:p>
+      <w:pPr>
+        <w:pStyle w:val="FirstParagraph"/>
+      </w:pPr>
+      <w:r>
+        <w:t xml:space="preserve">This study uses remote-sensing and land-use planning data and does not involve</w:t>
+      </w:r>
+      <w:r>
+        <w:t xml:space="preserve"> </w:t>
+      </w:r>
+      <w:r>
+        <w:t xml:space="preserve">human participants, human tissue, animal experiments, or private personal data.</w:t>
+      </w:r>
+      <w:r>
+        <w:t xml:space="preserve"> </w:t>
+      </w:r>
       <w:r>
         <w:t xml:space="preserve">Author confirmation is required before submission.</w:t>
       </w:r>
     </w:p>
-    <w:bookmarkEnd w:id="10"/>
-    <w:bookmarkStart w:id="11" w:name="funding"/>
-    <w:p>
-      <w:pPr>
-        <w:pStyle w:val="Heading2"/>
-      </w:pPr>
-      <w:r>
-        <w:t xml:space="preserve">Funding</w:t>
-      </w:r>
-    </w:p>
-    <w:p>
-      <w:pPr>
-        <w:pStyle w:val="FirstParagraph"/>
-      </w:pPr>
-      <w:r>
-        <w:t xml:space="preserve">[author-supplied funding statement required]</w:t>
-      </w:r>
-    </w:p>
-    <w:bookmarkEnd w:id="11"/>
-    <w:bookmarkStart w:id="12" w:name="author-contributions"/>
-    <w:p>
-      <w:pPr>
-        <w:pStyle w:val="Heading2"/>
-      </w:pPr>
-      <w:r>
-        <w:t xml:space="preserve">Author Contributions</w:t>
-      </w:r>
-    </w:p>
-    <w:p>
-      <w:pPr>
-        <w:pStyle w:val="FirstParagraph"/>
-      </w:pPr>
-      <w:r>
-        <w:t xml:space="preserve">[author-supplied CRediT author contribution statement required]</w:t>
-      </w:r>
-    </w:p>
     <w:bookmarkEnd w:id="12"/>
-    <w:bookmarkStart w:id="13" w:name="ethics-statement"/>
-    <w:p>
-      <w:pPr>
-        <w:pStyle w:val="Heading2"/>
-      </w:pPr>
-      <w:r>
-        <w:t xml:space="preserve">Ethics Statement</w:t>
-      </w:r>
-    </w:p>
-    <w:p>
-      <w:pPr>
-        <w:pStyle w:val="FirstParagraph"/>
-      </w:pPr>
-      <w:r>
-        <w:t xml:space="preserve">This study uses remote-sensing and land-use planning data and does not involve</w:t>
-      </w:r>
-      <w:r>
-        <w:t xml:space="preserve"> </w:t>
-      </w:r>
-      <w:r>
-        <w:t xml:space="preserve">human participants, human tissue, animal experiments, or private personal data.</w:t>
-      </w:r>
-      <w:r>
-        <w:t xml:space="preserve"> </w:t>
-      </w:r>
-      <w:r>
-        <w:t xml:space="preserve">Author confirmation is required before submission.</w:t>
-      </w:r>
-    </w:p>
-    <w:bookmarkEnd w:id="13"/>
-    <w:bookmarkStart w:id="14" w:name="data-availability"/>
+    <w:bookmarkStart w:id="13" w:name="data-availability"/>
     <w:p>
       <w:pPr>
         <w:pStyle w:val="Heading2"/>
@@ -417,8 +417,8 @@
         <w:t xml:space="preserve">only by authorized users.</w:t>
       </w:r>
     </w:p>
-    <w:bookmarkEnd w:id="14"/>
-    <w:bookmarkStart w:id="15" w:name="code-availability"/>
+    <w:bookmarkEnd w:id="13"/>
+    <w:bookmarkStart w:id="14" w:name="code-availability"/>
     <w:p>
       <w:pPr>
         <w:pStyle w:val="Heading2"/>
@@ -460,14 +460,56 @@
         <w:t xml:space="preserve">or archive DOI.</w:t>
       </w:r>
     </w:p>
+    <w:bookmarkEnd w:id="14"/>
+    <w:bookmarkStart w:id="15" w:name="ai-assisted-tools-statement"/>
+    <w:p>
+      <w:pPr>
+        <w:pStyle w:val="Heading2"/>
+      </w:pPr>
+      <w:r>
+        <w:t xml:space="preserve">AI-Assisted Tools Statement</w:t>
+      </w:r>
+    </w:p>
+    <w:p>
+      <w:pPr>
+        <w:pStyle w:val="FirstParagraph"/>
+      </w:pPr>
+      <w:r>
+        <w:t xml:space="preserve">AI-assisted tools were used for language editing, code assistance, and</w:t>
+      </w:r>
+      <w:r>
+        <w:t xml:space="preserve"> </w:t>
+      </w:r>
+      <w:r>
+        <w:t xml:space="preserve">submission-preparation drafting. All scientific claims, code outputs,</w:t>
+      </w:r>
+      <w:r>
+        <w:t xml:space="preserve"> </w:t>
+      </w:r>
+      <w:r>
+        <w:t xml:space="preserve">references, data interpretations, and manuscript text must be checked and</w:t>
+      </w:r>
+      <w:r>
+        <w:t xml:space="preserve"> </w:t>
+      </w:r>
+      <w:r>
+        <w:t xml:space="preserve">approved by the authors before submission. The final wording should be revised</w:t>
+      </w:r>
+      <w:r>
+        <w:t xml:space="preserve"> </w:t>
+      </w:r>
+      <w:r>
+        <w:t xml:space="preserve">to match the selected journal policy and the authors’ actual use.</w:t>
+      </w:r>
+    </w:p>
     <w:bookmarkEnd w:id="15"/>
-    <w:bookmarkStart w:id="16" w:name="ai-assisted-tools-statement"/>
+    <w:bookmarkStart w:id="16" w:name="claim-boundary-for-upload"/>
     <w:p>
       <w:pPr>
         <w:pStyle w:val="Heading2"/>
       </w:pPr>
       <w:r>
-        <w:t xml:space="preserve">AI-Assisted Tools Statement</w:t>
+        <w:t xml:space="preserve">Claim Boundary for Upload</w:t>
       </w:r>
     </w:p>
     <w:p>
@@ -475,83 +517,53 @@
         <w:pStyle w:val="FirstParagraph"/>
       </w:pPr>
       <w:r>
-        <w:t xml:space="preserve">AI-assisted tools were used for language editing, code assistance, and</w:t>
-      </w:r>
-      <w:r>
-        <w:t xml:space="preserve"> </w:t>
-      </w:r>
-      <w:r>
-        <w:t xml:space="preserve">submission-preparation drafting. All scientific claims, code outputs,</w:t>
-      </w:r>
-      <w:r>
-        <w:t xml:space="preserve"> </w:t>
-      </w:r>
-      <w:r>
-        <w:t xml:space="preserve">references, data interpretations, and manuscript text must be checked and</w:t>
-      </w:r>
-      <w:r>
-        <w:t xml:space="preserve"> </w:t>
-      </w:r>
-      <w:r>
-        <w:t xml:space="preserve">approved by the authors before submission. The final wording should be revised</w:t>
-      </w:r>
-      <w:r>
-        <w:t xml:space="preserve"> </w:t>
-      </w:r>
-      <w:r>
-        <w:t xml:space="preserve">to match the selected journal policy and the authors’ actual use.</w:t>
+        <w:t xml:space="preserve">This submission package supports a bounded positive compressed-GeoFM</w:t>
+      </w:r>
+      <w:r>
+        <w:t xml:space="preserve"> </w:t>
+      </w:r>
+      <w:r>
+        <w:t xml:space="preserve">representation manuscript. It does not support claims of raw GeoFM B1</w:t>
+      </w:r>
+      <w:r>
+        <w:t xml:space="preserve"> </w:t>
+      </w:r>
+      <w:r>
+        <w:t xml:space="preserve">superiority, B2/B3 readiness, suitability-reward improvement, cross-region</w:t>
+      </w:r>
+      <w:r>
+        <w:t xml:space="preserve"> </w:t>
+      </w:r>
+      <w:r>
+        <w:t xml:space="preserve">transfer, or independently validated agronomic suitability. The current</w:t>
+      </w:r>
+      <w:r>
+        <w:t xml:space="preserve"> </w:t>
+      </w:r>
+      <w:r>
+        <w:t xml:space="preserve">defensible conclusion is that compressed GeoFM state routes improve mean</w:t>
+      </w:r>
+      <w:r>
+        <w:t xml:space="preserve"> </w:t>
+      </w:r>
+      <w:r>
+        <w:t xml:space="preserve">held-out base-reward policy reward under the Bishan protocol, while raw GeoFM</w:t>
+      </w:r>
+      <w:r>
+        <w:t xml:space="preserve"> </w:t>
+      </w:r>
+      <w:r>
+        <w:t xml:space="preserve">state injection and the current suitability-reward route remain unsupported</w:t>
+      </w:r>
+      <w:r>
+        <w:t xml:space="preserve"> </w:t>
+      </w:r>
+      <w:r>
+        <w:t xml:space="preserve">under the completed Paper11 evidence gates.</w:t>
       </w:r>
     </w:p>
     <w:bookmarkEnd w:id="16"/>
-    <w:bookmarkStart w:id="17" w:name="claim-boundary-for-upload"/>
-    <w:p>
-      <w:pPr>
-        <w:pStyle w:val="Heading2"/>
-      </w:pPr>
-      <w:r>
-        <w:t xml:space="preserve">Claim Boundary for Upload</w:t>
-      </w:r>
-    </w:p>
-    <w:p>
-      <w:pPr>
-        <w:pStyle w:val="FirstParagraph"/>
-      </w:pPr>
-      <w:r>
-        <w:t xml:space="preserve">This submission package supports only a bounded negative/evidence-gated</w:t>
-      </w:r>
-      <w:r>
-        <w:t xml:space="preserve"> </w:t>
-      </w:r>
-      <w:r>
-        <w:t xml:space="preserve">manuscript. It does not support claims of GeoFM superiority, B2/B3 readiness,</w:t>
-      </w:r>
-      <w:r>
-        <w:t xml:space="preserve"> </w:t>
-      </w:r>
-      <w:r>
-        <w:t xml:space="preserve">suitability-reward improvement, cross-region transfer, or independently</w:t>
-      </w:r>
-      <w:r>
-        <w:t xml:space="preserve"> </w:t>
-      </w:r>
-      <w:r>
-        <w:t xml:space="preserve">validated agronomic suitability. The current defensible conclusion is that raw</w:t>
-      </w:r>
-      <w:r>
-        <w:t xml:space="preserve"> </w:t>
-      </w:r>
-      <w:r>
-        <w:t xml:space="preserve">GeoFM state injection and the current suitability-reward route are unsupported</w:t>
-      </w:r>
-      <w:r>
-        <w:t xml:space="preserve"> </w:t>
-      </w:r>
-      <w:r>
-        <w:t xml:space="preserve">under the completed Paper11 evidence gates.</w:t>
-      </w:r>
-    </w:p>
     <w:bookmarkEnd w:id="17"/>
-    <w:bookmarkEnd w:id="18"/>
     <w:sectPr>
       <w:footnotePr>
         <w:numRestart w:val="eachSect"/>

</xml_diff>

<commit_message>
feat: add Phase 49 compressed route robustness
</commit_message>
<xml_diff>
--- a/paper/submission/final/Paper11_cover_letter_and_declarations.docx
+++ b/paper/submission/final/Paper11_cover_letter_and_declarations.docx
@@ -131,13 +131,58 @@
         <w:t xml:space="preserve"> </w:t>
       </w:r>
       <w:r>
-        <w:t xml:space="preserve">held-out base-reward policy reward. Suitability-reward and B2/B3 claims remain</w:t>
-      </w:r>
-      <w:r>
-        <w:t xml:space="preserve"> </w:t>
-      </w:r>
-      <w:r>
-        <w:t xml:space="preserve">blocked by independent-label and calibrated-prior gates.</w:t>
+        <w:t xml:space="preserve">held-out base-reward policy reward. Phase 49 further shows that this compressed</w:t>
+      </w:r>
+      <w:r>
+        <w:t xml:space="preserve"> </w:t>
+      </w:r>
+      <w:r>
+        <w:t xml:space="preserve">route is statistically robust in the current Bishan protocol, with pooled</w:t>
+      </w:r>
+      <w:r>
+        <w:t xml:space="preserve"> </w:t>
+      </w:r>
+      <w:r>
+        <w:t xml:space="preserve">sign-test p</w:t>
+      </w:r>
+      <w:r>
+        <w:t xml:space="preserve"> </w:t>
+      </w:r>
+      <w:r>
+        <w:rPr>
+          <w:rStyle w:val="VerbatimChar"/>
+        </w:rPr>
+        <w:t xml:space="preserve">0.0031549137</w:t>
+      </w:r>
+      <w:r>
+        <w:t xml:space="preserve"> </w:t>
+      </w:r>
+      <w:r>
+        <w:t xml:space="preserve">and bootstrap CI95</w:t>
+      </w:r>
+      <w:r>
+        <w:t xml:space="preserve"> </w:t>
+      </w:r>
+      <w:r>
+        <w:rPr>
+          <w:rStyle w:val="VerbatimChar"/>
+        </w:rPr>
+        <w:t xml:space="preserve">[0.2827829983, 0.6639974489]</w:t>
+      </w:r>
+      <w:r>
+        <w:t xml:space="preserve">.</w:t>
+      </w:r>
+      <w:r>
+        <w:t xml:space="preserve"> </w:t>
+      </w:r>
+      <w:r>
+        <w:t xml:space="preserve">Suitability-reward and B2/B3 claims remain blocked by independent-label and</w:t>
+      </w:r>
+      <w:r>
+        <w:t xml:space="preserve"> </w:t>
+      </w:r>
+      <w:r>
+        <w:t xml:space="preserve">calibrated-prior gates.</w:t>
       </w:r>
     </w:p>
     <w:p>
@@ -547,19 +592,25 @@
         <w:t xml:space="preserve"> </w:t>
       </w:r>
       <w:r>
-        <w:t xml:space="preserve">held-out base-reward policy reward under the Bishan protocol, while raw GeoFM</w:t>
-      </w:r>
-      <w:r>
-        <w:t xml:space="preserve"> </w:t>
-      </w:r>
-      <w:r>
-        <w:t xml:space="preserve">state injection and the current suitability-reward route remain unsupported</w:t>
-      </w:r>
-      <w:r>
-        <w:t xml:space="preserve"> </w:t>
-      </w:r>
-      <w:r>
-        <w:t xml:space="preserve">under the completed Paper11 evidence gates.</w:t>
+        <w:t xml:space="preserve">held-out base-reward policy reward under the Bishan protocol and remain</w:t>
+      </w:r>
+      <w:r>
+        <w:t xml:space="preserve"> </w:t>
+      </w:r>
+      <w:r>
+        <w:t xml:space="preserve">positive under Phase 49 robustness checks, while raw GeoFM state injection and</w:t>
+      </w:r>
+      <w:r>
+        <w:t xml:space="preserve"> </w:t>
+      </w:r>
+      <w:r>
+        <w:t xml:space="preserve">the current suitability-reward route remain unsupported under the completed</w:t>
+      </w:r>
+      <w:r>
+        <w:t xml:space="preserve"> </w:t>
+      </w:r>
+      <w:r>
+        <w:t xml:space="preserve">Paper11 evidence gates.</w:t>
       </w:r>
     </w:p>
     <w:bookmarkEnd w:id="16"/>

</xml_diff>

<commit_message>
feat: add Phase 50 cluster robustness audit
</commit_message>
<xml_diff>
--- a/paper/submission/final/Paper11_cover_letter_and_declarations.docx
+++ b/paper/submission/final/Paper11_cover_letter_and_declarations.docx
@@ -176,6 +176,45 @@
         <w:t xml:space="preserve"> </w:t>
       </w:r>
       <w:r>
+        <w:t xml:space="preserve">Phase 50 provides a conservative cluster-level boundary:</w:t>
+      </w:r>
+      <w:r>
+        <w:t xml:space="preserve"> </w:t>
+      </w:r>
+      <w:r>
+        <w:rPr>
+          <w:rStyle w:val="VerbatimChar"/>
+        </w:rPr>
+        <w:t xml:space="preserve">7 / 9</w:t>
+      </w:r>
+      <w:r>
+        <w:t xml:space="preserve"> </w:t>
+      </w:r>
+      <w:r>
+        <w:t xml:space="preserve">tile-seed</w:t>
+      </w:r>
+      <w:r>
+        <w:t xml:space="preserve"> </w:t>
+      </w:r>
+      <w:r>
+        <w:t xml:space="preserve">clusters are positive, but the cluster sign-test p is</w:t>
+      </w:r>
+      <w:r>
+        <w:t xml:space="preserve"> </w:t>
+      </w:r>
+      <w:r>
+        <w:rPr>
+          <w:rStyle w:val="VerbatimChar"/>
+        </w:rPr>
+        <w:t xml:space="preserve">0.08984375</w:t>
+      </w:r>
+      <w:r>
+        <w:t xml:space="preserve">.</w:t>
+      </w:r>
+      <w:r>
+        <w:t xml:space="preserve"> </w:t>
+      </w:r>
+      <w:r>
         <w:t xml:space="preserve">Suitability-reward and B2/B3 claims remain blocked by independent-label and</w:t>
       </w:r>
       <w:r>
@@ -598,7 +637,19 @@
         <w:t xml:space="preserve"> </w:t>
       </w:r>
       <w:r>
-        <w:t xml:space="preserve">positive under Phase 49 robustness checks, while raw GeoFM state injection and</w:t>
+        <w:t xml:space="preserve">positive under Phase 49 robustness checks, with Phase 50 cluster-level evidence</w:t>
+      </w:r>
+      <w:r>
+        <w:t xml:space="preserve"> </w:t>
+      </w:r>
+      <w:r>
+        <w:t xml:space="preserve">remaining directional rather than alpha-0.05 significant, while raw GeoFM state</w:t>
+      </w:r>
+      <w:r>
+        <w:t xml:space="preserve"> </w:t>
+      </w:r>
+      <w:r>
+        <w:t xml:space="preserve">injection and</w:t>
       </w:r>
       <w:r>
         <w:t xml:space="preserve"> </w:t>

</xml_diff>

<commit_message>
feat: add Phase 51 cluster magnitude support
</commit_message>
<xml_diff>
--- a/paper/submission/final/Paper11_cover_letter_and_declarations.docx
+++ b/paper/submission/final/Paper11_cover_letter_and_declarations.docx
@@ -197,7 +197,7 @@
         <w:t xml:space="preserve"> </w:t>
       </w:r>
       <w:r>
-        <w:t xml:space="preserve">clusters are positive, but the cluster sign-test p is</w:t>
+        <w:t xml:space="preserve">clusters are positive, the cluster sign-test p is</w:t>
       </w:r>
       <w:r>
         <w:t xml:space="preserve"> </w:t>
@@ -209,6 +209,18 @@
         <w:t xml:space="preserve">0.08984375</w:t>
       </w:r>
       <w:r>
+        <w:t xml:space="preserve">, and Phase 51 exact signed-rank testing supports the cluster magnitude effect with p</w:t>
+      </w:r>
+      <w:r>
+        <w:t xml:space="preserve"> </w:t>
+      </w:r>
+      <w:r>
+        <w:rPr>
+          <w:rStyle w:val="VerbatimChar"/>
+        </w:rPr>
+        <w:t xml:space="preserve">0.01953125</w:t>
+      </w:r>
+      <w:r>
         <w:t xml:space="preserve">.</w:t>
       </w:r>
       <w:r>
@@ -643,7 +655,7 @@
         <w:t xml:space="preserve"> </w:t>
       </w:r>
       <w:r>
-        <w:t xml:space="preserve">remaining directional rather than alpha-0.05 significant, while raw GeoFM state</w:t>
+        <w:t xml:space="preserve">remaining directional by sign test but supported by Phase 51 signed-rank magnitude testing, while raw GeoFM state</w:t>
       </w:r>
       <w:r>
         <w:t xml:space="preserve"> </w:t>

</xml_diff>

<commit_message>
docs: add Phase 52 expanded replication evidence
</commit_message>
<xml_diff>
--- a/paper/submission/final/Paper11_cover_letter_and_declarations.docx
+++ b/paper/submission/final/Paper11_cover_letter_and_declarations.docx
@@ -227,13 +227,70 @@
         <w:t xml:space="preserve"> </w:t>
       </w:r>
       <w:r>
-        <w:t xml:space="preserve">Suitability-reward and B2/B3 claims remain blocked by independent-label and</w:t>
-      </w:r>
-      <w:r>
-        <w:t xml:space="preserve"> </w:t>
-      </w:r>
-      <w:r>
-        <w:t xml:space="preserve">calibrated-prior gates.</w:t>
+        <w:t xml:space="preserve">Phase 52 expands the same six-variant protocol to five held-out tiles and three</w:t>
+      </w:r>
+      <w:r>
+        <w:t xml:space="preserve"> </w:t>
+      </w:r>
+      <w:r>
+        <w:t xml:space="preserve">seeds, again supporting the compressed route with pooled delta</w:t>
+      </w:r>
+      <w:r>
+        <w:t xml:space="preserve"> </w:t>
+      </w:r>
+      <w:r>
+        <w:rPr>
+          <w:rStyle w:val="VerbatimChar"/>
+        </w:rPr>
+        <w:t xml:space="preserve">0.2921767818</w:t>
+      </w:r>
+      <w:r>
+        <w:t xml:space="preserve">,</w:t>
+      </w:r>
+      <w:r>
+        <w:t xml:space="preserve"> </w:t>
+      </w:r>
+      <w:r>
+        <w:rPr>
+          <w:rStyle w:val="VerbatimChar"/>
+        </w:rPr>
+        <w:t xml:space="preserve">74 / 120</w:t>
+      </w:r>
+      <w:r>
+        <w:t xml:space="preserve"> </w:t>
+      </w:r>
+      <w:r>
+        <w:t xml:space="preserve">positive row-level comparisons, row-level sign-test p</w:t>
+      </w:r>
+      <w:r>
+        <w:t xml:space="preserve"> </w:t>
+      </w:r>
+      <w:r>
+        <w:rPr>
+          <w:rStyle w:val="VerbatimChar"/>
+        </w:rPr>
+        <w:t xml:space="preserve">0.0066881634</w:t>
+      </w:r>
+      <w:r>
+        <w:t xml:space="preserve">, and cluster signed-rank p</w:t>
+      </w:r>
+      <w:r>
+        <w:t xml:space="preserve"> </w:t>
+      </w:r>
+      <w:r>
+        <w:rPr>
+          <w:rStyle w:val="VerbatimChar"/>
+        </w:rPr>
+        <w:t xml:space="preserve">0.0206298828</w:t>
+      </w:r>
+      <w:r>
+        <w:t xml:space="preserve">. Suitability-reward</w:t>
+      </w:r>
+      <w:r>
+        <w:t xml:space="preserve"> </w:t>
+      </w:r>
+      <w:r>
+        <w:t xml:space="preserve">and B2/B3 claims remain blocked by independent-label and calibrated-prior gates.</w:t>
       </w:r>
     </w:p>
     <w:p>
@@ -649,31 +706,31 @@
         <w:t xml:space="preserve"> </w:t>
       </w:r>
       <w:r>
-        <w:t xml:space="preserve">positive under Phase 49 robustness checks, with Phase 50 cluster-level evidence</w:t>
-      </w:r>
-      <w:r>
-        <w:t xml:space="preserve"> </w:t>
-      </w:r>
-      <w:r>
-        <w:t xml:space="preserve">remaining directional by sign test but supported by Phase 51 signed-rank magnitude testing, while raw GeoFM state</w:t>
-      </w:r>
-      <w:r>
-        <w:t xml:space="preserve"> </w:t>
-      </w:r>
-      <w:r>
-        <w:t xml:space="preserve">injection and</w:t>
-      </w:r>
-      <w:r>
-        <w:t xml:space="preserve"> </w:t>
-      </w:r>
-      <w:r>
-        <w:t xml:space="preserve">the current suitability-reward route remain unsupported under the completed</w:t>
-      </w:r>
-      <w:r>
-        <w:t xml:space="preserve"> </w:t>
-      </w:r>
-      <w:r>
-        <w:t xml:space="preserve">Paper11 evidence gates.</w:t>
+        <w:t xml:space="preserve">positive under Phase 49 robustness checks and Phase 52 expanded replication,</w:t>
+      </w:r>
+      <w:r>
+        <w:t xml:space="preserve"> </w:t>
+      </w:r>
+      <w:r>
+        <w:t xml:space="preserve">with Phase 50 and Phase 52 cluster-level evidence remaining directional by sign</w:t>
+      </w:r>
+      <w:r>
+        <w:t xml:space="preserve"> </w:t>
+      </w:r>
+      <w:r>
+        <w:t xml:space="preserve">test but supported by signed-rank magnitude testing, while raw GeoFM state</w:t>
+      </w:r>
+      <w:r>
+        <w:t xml:space="preserve"> </w:t>
+      </w:r>
+      <w:r>
+        <w:t xml:space="preserve">injection and the current suitability-reward route remain unsupported under the</w:t>
+      </w:r>
+      <w:r>
+        <w:t xml:space="preserve"> </w:t>
+      </w:r>
+      <w:r>
+        <w:t xml:space="preserve">completed Paper11 evidence gates.</w:t>
       </w:r>
     </w:p>
     <w:bookmarkEnd w:id="16"/>

</xml_diff>

<commit_message>
docs: add Phase 53 cluster mean support evidence
</commit_message>
<xml_diff>
--- a/paper/submission/final/Paper11_cover_letter_and_declarations.docx
+++ b/paper/submission/final/Paper11_cover_letter_and_declarations.docx
@@ -284,7 +284,43 @@
         <w:t xml:space="preserve">0.0206298828</w:t>
       </w:r>
       <w:r>
-        <w:t xml:space="preserve">. Suitability-reward</w:t>
+        <w:t xml:space="preserve">. Phase 53 supports the</w:t>
+      </w:r>
+      <w:r>
+        <w:t xml:space="preserve"> </w:t>
+      </w:r>
+      <w:r>
+        <w:t xml:space="preserve">expanded cluster mean with exact sign-flip p</w:t>
+      </w:r>
+      <w:r>
+        <w:t xml:space="preserve"> </w:t>
+      </w:r>
+      <w:r>
+        <w:rPr>
+          <w:rStyle w:val="VerbatimChar"/>
+        </w:rPr>
+        <w:t xml:space="preserve">0.0196838379</w:t>
+      </w:r>
+      <w:r>
+        <w:t xml:space="preserve">, bootstrap CI95</w:t>
+      </w:r>
+      <w:r>
+        <w:t xml:space="preserve"> </w:t>
+      </w:r>
+      <w:r>
+        <w:rPr>
+          <w:rStyle w:val="VerbatimChar"/>
+        </w:rPr>
+        <w:t xml:space="preserve">[0.0570820445, 0.5823557658]</w:t>
+      </w:r>
+      <w:r>
+        <w:t xml:space="preserve">, and positive leave-one cluster, tile, and seed</w:t>
+      </w:r>
+      <w:r>
+        <w:t xml:space="preserve"> </w:t>
+      </w:r>
+      <w:r>
+        <w:t xml:space="preserve">means. Suitability-reward</w:t>
       </w:r>
       <w:r>
         <w:t xml:space="preserve"> </w:t>
@@ -718,19 +754,25 @@
         <w:t xml:space="preserve"> </w:t>
       </w:r>
       <w:r>
-        <w:t xml:space="preserve">test but supported by signed-rank magnitude testing, while raw GeoFM state</w:t>
-      </w:r>
-      <w:r>
-        <w:t xml:space="preserve"> </w:t>
-      </w:r>
-      <w:r>
-        <w:t xml:space="preserve">injection and the current suitability-reward route remain unsupported under the</w:t>
-      </w:r>
-      <w:r>
-        <w:t xml:space="preserve"> </w:t>
-      </w:r>
-      <w:r>
-        <w:t xml:space="preserve">completed Paper11 evidence gates.</w:t>
+        <w:t xml:space="preserve">test but supported by signed-rank magnitude testing and Phase 53 cluster-mean</w:t>
+      </w:r>
+      <w:r>
+        <w:t xml:space="preserve"> </w:t>
+      </w:r>
+      <w:r>
+        <w:t xml:space="preserve">influence checks, while raw GeoFM state injection and the current</w:t>
+      </w:r>
+      <w:r>
+        <w:t xml:space="preserve"> </w:t>
+      </w:r>
+      <w:r>
+        <w:t xml:space="preserve">suitability-reward route remain unsupported under the completed Paper11</w:t>
+      </w:r>
+      <w:r>
+        <w:t xml:space="preserve"> </w:t>
+      </w:r>
+      <w:r>
+        <w:t xml:space="preserve">evidence gates.</w:t>
       </w:r>
     </w:p>
     <w:bookmarkEnd w:id="16"/>

</xml_diff>

<commit_message>
docs: add Phase 54 artifact lineage audit
</commit_message>
<xml_diff>
--- a/paper/submission/final/Paper11_cover_letter_and_declarations.docx
+++ b/paper/submission/final/Paper11_cover_letter_and_declarations.docx
@@ -320,7 +320,25 @@
         <w:t xml:space="preserve"> </w:t>
       </w:r>
       <w:r>
-        <w:t xml:space="preserve">means. Suitability-reward</w:t>
+        <w:t xml:space="preserve">means. Phase 54 reports</w:t>
+      </w:r>
+      <w:r>
+        <w:t xml:space="preserve"> </w:t>
+      </w:r>
+      <w:r>
+        <w:rPr>
+          <w:rStyle w:val="VerbatimChar"/>
+        </w:rPr>
+        <w:t xml:space="preserve">artifact_lineage_consistent</w:t>
+      </w:r>
+      <w:r>
+        <w:t xml:space="preserve">, verifying that the formal</w:t>
+      </w:r>
+      <w:r>
+        <w:t xml:space="preserve"> </w:t>
+      </w:r>
+      <w:r>
+        <w:t xml:space="preserve">Phase 52/53 values come from one authoritative artifact chain. Suitability-reward</w:t>
       </w:r>
       <w:r>
         <w:t xml:space="preserve"> </w:t>
@@ -760,19 +778,19 @@
         <w:t xml:space="preserve"> </w:t>
       </w:r>
       <w:r>
-        <w:t xml:space="preserve">influence checks, while raw GeoFM state injection and the current</w:t>
-      </w:r>
-      <w:r>
-        <w:t xml:space="preserve"> </w:t>
-      </w:r>
-      <w:r>
-        <w:t xml:space="preserve">suitability-reward route remain unsupported under the completed Paper11</w:t>
-      </w:r>
-      <w:r>
-        <w:t xml:space="preserve"> </w:t>
-      </w:r>
-      <w:r>
-        <w:t xml:space="preserve">evidence gates.</w:t>
+        <w:t xml:space="preserve">influence checks. Phase 54 verifies the formal artifact lineage. Raw GeoFM state</w:t>
+      </w:r>
+      <w:r>
+        <w:t xml:space="preserve"> </w:t>
+      </w:r>
+      <w:r>
+        <w:t xml:space="preserve">injection and the current suitability-reward route remain unsupported under the</w:t>
+      </w:r>
+      <w:r>
+        <w:t xml:space="preserve"> </w:t>
+      </w:r>
+      <w:r>
+        <w:t xml:space="preserve">completed Paper11 evidence gates.</w:t>
       </w:r>
     </w:p>
     <w:bookmarkEnd w:id="16"/>

</xml_diff>